<commit_message>
Remove the Displace filter from the cover and all documents
The autocomplete bar is now flat, with no displacement warp or lighting
shade. The guide and planning sheet use Content-Aware Fill as the
independently learned skill instead, since Displace is not normally
taught at Grade 11. Process stages, contact sheet, layer proof sheet and
the GIMP copy are regenerated to match.

Co-Authored-By: Claude Opus 5.5 <noreply@anthropic.com>
Claude-Session: https://claude.ai/code/session_01MJBkono5h2ZQhPNMyZWo68
</commit_message>
<xml_diff>
--- a/out/PROMPT_FINISH_IT_YOURSELF_guide.docx
+++ b/out/PROMPT_FINISH_IT_YOURSELF_guide.docx
@@ -16,7 +16,7 @@
         <w:rPr>
           <w:i w:val="0"/>
         </w:rPr>
-        <w:t>Open PROMPT_STARTER.psd in Photoshop. The text and layout are already done. You do the photo editing - the part your teacher is marking. About 1 to 2 class periods. Take a screenshot at every camera step for your process work.</w:t>
+        <w:t>Open PROMPT_STARTER.psd in Photoshop. The text and layout are already done. You do the photo editing - the part your teacher is marking. About 1 class period. Take a screenshot at every camera step for your process work.</w:t>
       </w:r>
     </w:p>
     <w:p>
@@ -45,7 +45,15 @@
           <w:color w:val="2E6B1E"/>
           <w:sz w:val="26"/>
         </w:rPr>
-        <w:t>Step 1 - Remove the mouth</w:t>
+        <w:t>Step 1 - Remove the mouth (NEW SKILL: Content-Aware Fill)</w:t>
+      </w:r>
+    </w:p>
+    <w:p>
+      <w:r>
+        <w:rPr>
+          <w:i w:val="0"/>
+        </w:rPr>
+        <w:t>This is your "independently learned" skill. Before you start, watch a short YouTube video: search "Photoshop content aware fill tutorial".</w:t>
       </w:r>
     </w:p>
     <w:p>
@@ -264,125 +272,7 @@
           <w:color w:val="2E6B1E"/>
           <w:sz w:val="26"/>
         </w:rPr>
-        <w:t>Step 4 - Bend the bar onto her face (NEW SKILL: Displace filter)</w:t>
-      </w:r>
-    </w:p>
-    <w:p>
-      <w:r>
-        <w:rPr>
-          <w:i w:val="0"/>
-        </w:rPr>
-        <w:t>This is your "independently learned" skill. First watch a short YouTube video: search "Photoshop displacement map tutorial". Then:</w:t>
-      </w:r>
-    </w:p>
-    <w:p>
-      <w:r>
-        <w:rPr>
-          <w:i/>
-        </w:rPr>
-        <w:t>Make the map:</w:t>
-      </w:r>
-    </w:p>
-    <w:p>
-      <w:pPr>
-        <w:pStyle w:val="ListNumber"/>
-      </w:pPr>
-      <w:r>
-        <w:t>Click "Portrait - no mouth". Press Ctrl+J (Cmd+J) to copy it.</w:t>
-      </w:r>
-    </w:p>
-    <w:p>
-      <w:pPr>
-        <w:pStyle w:val="ListNumber"/>
-      </w:pPr>
-      <w:r>
-        <w:t>Image &gt; Adjustments &gt; Desaturate. Then Filter &gt; Blur &gt; Gaussian Blur, Radius 30 &gt; OK.</w:t>
-      </w:r>
-    </w:p>
-    <w:p>
-      <w:pPr>
-        <w:pStyle w:val="ListNumber"/>
-      </w:pPr>
-      <w:r>
-        <w:t>Right-click that blurry layer &gt; Duplicate Layer. Under Document pick "New" &gt; OK.</w:t>
-      </w:r>
-    </w:p>
-    <w:p>
-      <w:pPr>
-        <w:pStyle w:val="ListNumber"/>
-      </w:pPr>
-      <w:r>
-        <w:t>In the new window: File &gt; Save As &gt; name it facemap, format Photoshop (.psd), save it on your Desktop. Close that window.</w:t>
-      </w:r>
-    </w:p>
-    <w:p>
-      <w:pPr>
-        <w:pStyle w:val="ListNumber"/>
-      </w:pPr>
-      <w:r>
-        <w:t>Back in your cover, delete the blurry layer (drag it to the trash can).</w:t>
-      </w:r>
-    </w:p>
-    <w:p>
-      <w:r>
-        <w:rPr>
-          <w:i/>
-        </w:rPr>
-        <w:t>Use the map:</w:t>
-      </w:r>
-    </w:p>
-    <w:p>
-      <w:pPr>
-        <w:pStyle w:val="ListNumber"/>
-      </w:pPr>
-      <w:r>
-        <w:t>Turn the eye back on for 03 AUTOCOMPLETE BAR.</w:t>
-      </w:r>
-    </w:p>
-    <w:p>
-      <w:pPr>
-        <w:pStyle w:val="ListNumber"/>
-      </w:pPr>
-      <w:r>
-        <w:t>Right-click the 03 AUTOCOMPLETE BAR folder &gt; Convert to Smart Object.</w:t>
-      </w:r>
-    </w:p>
-    <w:p>
-      <w:pPr>
-        <w:pStyle w:val="ListNumber"/>
-      </w:pPr>
-      <w:r>
-        <w:t>Filter &gt; Distort &gt; Displace. Horizontal Scale 20, Vertical Scale 11, Stretch To Fit, Repeat Edge Pixels &gt; OK. When it asks for a file, pick facemap.psd.</w:t>
-      </w:r>
-    </w:p>
-    <w:p>
-      <w:r>
-        <w:rPr>
-          <w:b/>
-        </w:rPr>
-        <w:t>SCREENSHOT: the bar before and after Displace.</w:t>
-      </w:r>
-    </w:p>
-    <w:p>
-      <w:r>
-        <w:rPr>
-          <w:i/>
-          <w:color w:val="555B55"/>
-        </w:rPr>
-        <w:t>Why: the bar now curves with her cheeks and jaw, so it looks like it is on her skin instead of pasted on top.</w:t>
-      </w:r>
-    </w:p>
-    <w:p>
-      <w:pPr>
-        <w:spacing w:before="280"/>
-      </w:pPr>
-      <w:r>
-        <w:rPr>
-          <w:b/>
-          <w:color w:val="2E6B1E"/>
-          <w:sz w:val="26"/>
-        </w:rPr>
-        <w:t>Step 5 - Save both files</w:t>
+        <w:t>Step 4 - Save both files</w:t>
       </w:r>
     </w:p>
     <w:p>
@@ -459,7 +349,7 @@
         <w:pStyle w:val="ListBullet"/>
       </w:pPr>
       <w:r>
-        <w:t>Bar bending: "I learned the Displace filter from a YouTube tutorial. You make a blurry black-and-white copy of the face and use it as a map to bend the bar."</w:t>
+        <w:t>New skill: "I learned Content-Aware Fill from a YouTube tutorial. You select something and Photoshop fills it in using the pixels around it."</w:t>
       </w:r>
     </w:p>
     <w:p>

</xml_diff>